<commit_message>
Fix make_label bug, add TSLab scripts (SUI/BCH/TRX), update docx report with 10 instruments
</commit_message>
<xml_diff>
--- a/TsLabWorkspace/nn-trading/NN_Trading_Report_v2.docx
+++ b/TsLabWorkspace/nn-trading/NN_Trading_Report_v2.docx
@@ -168,7 +168,7 @@
         <w:rPr>
           <w:color w:val="003366"/>
         </w:rPr>
-        <w:t>4.1 Результаты по инструментам</w:t>
+        <w:t>4.1 Walk-forward: 10 инструментов (3 фолда)</w:t>
       </w:r>
     </w:p>
     <w:tbl>
@@ -273,7 +273,7 @@
           </w:tcPr>
           <w:p>
             <w:r>
-              <w:t>Bitcoin</w:t>
+              <w:t>NEAR</w:t>
             </w:r>
           </w:p>
         </w:tc>
@@ -283,7 +283,7 @@
           </w:tcPr>
           <w:p>
             <w:r>
-              <w:t>-17.67%</w:t>
+              <w:t>+18.24%</w:t>
             </w:r>
           </w:p>
         </w:tc>
@@ -293,7 +293,7 @@
           </w:tcPr>
           <w:p>
             <w:r>
-              <w:t>-26.82%</w:t>
+              <w:t>-22.86%</w:t>
             </w:r>
           </w:p>
         </w:tc>
@@ -303,7 +303,7 @@
           </w:tcPr>
           <w:p>
             <w:r>
-              <w:t>32.5%</w:t>
+              <w:t>36.4%</w:t>
             </w:r>
           </w:p>
         </w:tc>
@@ -313,7 +313,7 @@
           </w:tcPr>
           <w:p>
             <w:r>
-              <w:t>-0.74</w:t>
+              <w:t>0.80</w:t>
             </w:r>
           </w:p>
         </w:tc>
@@ -323,7 +323,7 @@
           </w:tcPr>
           <w:p>
             <w:r>
-              <w:t>-2.96</w:t>
+              <w:t>2.93</w:t>
             </w:r>
           </w:p>
         </w:tc>
@@ -335,7 +335,7 @@
           </w:tcPr>
           <w:p>
             <w:r>
-              <w:t>Ethereum</w:t>
+              <w:t>XLM</w:t>
             </w:r>
           </w:p>
         </w:tc>
@@ -345,7 +345,7 @@
           </w:tcPr>
           <w:p>
             <w:r>
-              <w:t>+43.03%</w:t>
+              <w:t>+20.62%</w:t>
             </w:r>
           </w:p>
         </w:tc>
@@ -355,7 +355,7 @@
           </w:tcPr>
           <w:p>
             <w:r>
-              <w:t>-20.93%</w:t>
+              <w:t>-8.08%</w:t>
             </w:r>
           </w:p>
         </w:tc>
@@ -365,7 +365,7 @@
           </w:tcPr>
           <w:p>
             <w:r>
-              <w:t>37.5%</w:t>
+              <w:t>39.9%</w:t>
             </w:r>
           </w:p>
         </w:tc>
@@ -375,7 +375,7 @@
           </w:tcPr>
           <w:p>
             <w:r>
-              <w:t>1.17</w:t>
+              <w:t>2.48</w:t>
             </w:r>
           </w:p>
         </w:tc>
@@ -385,7 +385,7 @@
           </w:tcPr>
           <w:p>
             <w:r>
-              <w:t>6.62</w:t>
+              <w:t>15.62</w:t>
             </w:r>
           </w:p>
         </w:tc>
@@ -397,7 +397,7 @@
           </w:tcPr>
           <w:p>
             <w:r>
-              <w:t>Solana</w:t>
+              <w:t>SOL</w:t>
             </w:r>
           </w:p>
         </w:tc>
@@ -407,7 +407,7 @@
           </w:tcPr>
           <w:p>
             <w:r>
-              <w:t>+387.64%</w:t>
+              <w:t>+11.70%</w:t>
             </w:r>
           </w:p>
         </w:tc>
@@ -417,7 +417,7 @@
           </w:tcPr>
           <w:p>
             <w:r>
-              <w:t>-11.39%</w:t>
+              <w:t>-11.14%</w:t>
             </w:r>
           </w:p>
         </w:tc>
@@ -427,7 +427,7 @@
           </w:tcPr>
           <w:p>
             <w:r>
-              <w:t>38.0%</w:t>
+              <w:t>21.8%</w:t>
             </w:r>
           </w:p>
         </w:tc>
@@ -437,7 +437,7 @@
           </w:tcPr>
           <w:p>
             <w:r>
-              <w:t>3.43</w:t>
+              <w:t>1.26</w:t>
             </w:r>
           </w:p>
         </w:tc>
@@ -447,7 +447,379 @@
           </w:tcPr>
           <w:p>
             <w:r>
-              <w:t>22.02</w:t>
+              <w:t>6.02</w:t>
+            </w:r>
+          </w:p>
+        </w:tc>
+      </w:tr>
+      <w:tr>
+        <w:tc>
+          <w:tcPr>
+            <w:tcW w:type="dxa" w:w="1440"/>
+          </w:tcPr>
+          <w:p>
+            <w:r>
+              <w:t>AAVE</w:t>
+            </w:r>
+          </w:p>
+        </w:tc>
+        <w:tc>
+          <w:tcPr>
+            <w:tcW w:type="dxa" w:w="1440"/>
+          </w:tcPr>
+          <w:p>
+            <w:r>
+              <w:t>+9.06%</w:t>
+            </w:r>
+          </w:p>
+        </w:tc>
+        <w:tc>
+          <w:tcPr>
+            <w:tcW w:type="dxa" w:w="1440"/>
+          </w:tcPr>
+          <w:p>
+            <w:r>
+              <w:t>-10.33%</w:t>
+            </w:r>
+          </w:p>
+        </w:tc>
+        <w:tc>
+          <w:tcPr>
+            <w:tcW w:type="dxa" w:w="1440"/>
+          </w:tcPr>
+          <w:p>
+            <w:r>
+              <w:t>25.4%</w:t>
+            </w:r>
+          </w:p>
+        </w:tc>
+        <w:tc>
+          <w:tcPr>
+            <w:tcW w:type="dxa" w:w="1440"/>
+          </w:tcPr>
+          <w:p>
+            <w:r>
+              <w:t>1.01</w:t>
+            </w:r>
+          </w:p>
+        </w:tc>
+        <w:tc>
+          <w:tcPr>
+            <w:tcW w:type="dxa" w:w="1440"/>
+          </w:tcPr>
+          <w:p>
+            <w:r>
+              <w:t>4.42</w:t>
+            </w:r>
+          </w:p>
+        </w:tc>
+      </w:tr>
+      <w:tr>
+        <w:tc>
+          <w:tcPr>
+            <w:tcW w:type="dxa" w:w="1440"/>
+          </w:tcPr>
+          <w:p>
+            <w:r>
+              <w:t>LINK</w:t>
+            </w:r>
+          </w:p>
+        </w:tc>
+        <w:tc>
+          <w:tcPr>
+            <w:tcW w:type="dxa" w:w="1440"/>
+          </w:tcPr>
+          <w:p>
+            <w:r>
+              <w:t>-13.41%</w:t>
+            </w:r>
+          </w:p>
+        </w:tc>
+        <w:tc>
+          <w:tcPr>
+            <w:tcW w:type="dxa" w:w="1440"/>
+          </w:tcPr>
+          <w:p>
+            <w:r>
+              <w:t>-19.41%</w:t>
+            </w:r>
+          </w:p>
+        </w:tc>
+        <w:tc>
+          <w:tcPr>
+            <w:tcW w:type="dxa" w:w="1440"/>
+          </w:tcPr>
+          <w:p>
+            <w:r>
+              <w:t>25.8%</w:t>
+            </w:r>
+          </w:p>
+        </w:tc>
+        <w:tc>
+          <w:tcPr>
+            <w:tcW w:type="dxa" w:w="1440"/>
+          </w:tcPr>
+          <w:p>
+            <w:r>
+              <w:t>-1.97</w:t>
+            </w:r>
+          </w:p>
+        </w:tc>
+        <w:tc>
+          <w:tcPr>
+            <w:tcW w:type="dxa" w:w="1440"/>
+          </w:tcPr>
+          <w:p>
+            <w:r>
+              <w:t>-6.12</w:t>
+            </w:r>
+          </w:p>
+        </w:tc>
+      </w:tr>
+      <w:tr>
+        <w:tc>
+          <w:tcPr>
+            <w:tcW w:type="dxa" w:w="1440"/>
+          </w:tcPr>
+          <w:p>
+            <w:r>
+              <w:t>ADA</w:t>
+            </w:r>
+          </w:p>
+        </w:tc>
+        <w:tc>
+          <w:tcPr>
+            <w:tcW w:type="dxa" w:w="1440"/>
+          </w:tcPr>
+          <w:p>
+            <w:r>
+              <w:t>-7.74%</w:t>
+            </w:r>
+          </w:p>
+        </w:tc>
+        <w:tc>
+          <w:tcPr>
+            <w:tcW w:type="dxa" w:w="1440"/>
+          </w:tcPr>
+          <w:p>
+            <w:r>
+              <w:t>-17.04%</w:t>
+            </w:r>
+          </w:p>
+        </w:tc>
+        <w:tc>
+          <w:tcPr>
+            <w:tcW w:type="dxa" w:w="1440"/>
+          </w:tcPr>
+          <w:p>
+            <w:r>
+              <w:t>33.0%</w:t>
+            </w:r>
+          </w:p>
+        </w:tc>
+        <w:tc>
+          <w:tcPr>
+            <w:tcW w:type="dxa" w:w="1440"/>
+          </w:tcPr>
+          <w:p>
+            <w:r>
+              <w:t>-0.54</w:t>
+            </w:r>
+          </w:p>
+        </w:tc>
+        <w:tc>
+          <w:tcPr>
+            <w:tcW w:type="dxa" w:w="1440"/>
+          </w:tcPr>
+          <w:p>
+            <w:r>
+              <w:t>-2.05</w:t>
+            </w:r>
+          </w:p>
+        </w:tc>
+      </w:tr>
+      <w:tr>
+        <w:tc>
+          <w:tcPr>
+            <w:tcW w:type="dxa" w:w="1440"/>
+          </w:tcPr>
+          <w:p>
+            <w:r>
+              <w:t>BCH</w:t>
+            </w:r>
+          </w:p>
+        </w:tc>
+        <w:tc>
+          <w:tcPr>
+            <w:tcW w:type="dxa" w:w="1440"/>
+          </w:tcPr>
+          <w:p>
+            <w:r>
+              <w:t>+2.36%</w:t>
+            </w:r>
+          </w:p>
+        </w:tc>
+        <w:tc>
+          <w:tcPr>
+            <w:tcW w:type="dxa" w:w="1440"/>
+          </w:tcPr>
+          <w:p>
+            <w:r>
+              <w:t>-4.72%</w:t>
+            </w:r>
+          </w:p>
+        </w:tc>
+        <w:tc>
+          <w:tcPr>
+            <w:tcW w:type="dxa" w:w="1440"/>
+          </w:tcPr>
+          <w:p>
+            <w:r>
+              <w:t>26.5%</w:t>
+            </w:r>
+          </w:p>
+        </w:tc>
+        <w:tc>
+          <w:tcPr>
+            <w:tcW w:type="dxa" w:w="1440"/>
+          </w:tcPr>
+          <w:p>
+            <w:r>
+              <w:t>1.55</w:t>
+            </w:r>
+          </w:p>
+        </w:tc>
+        <w:tc>
+          <w:tcPr>
+            <w:tcW w:type="dxa" w:w="1440"/>
+          </w:tcPr>
+          <w:p>
+            <w:r>
+              <w:t>6.27</w:t>
+            </w:r>
+          </w:p>
+        </w:tc>
+      </w:tr>
+      <w:tr>
+        <w:tc>
+          <w:tcPr>
+            <w:tcW w:type="dxa" w:w="1440"/>
+          </w:tcPr>
+          <w:p>
+            <w:r>
+              <w:t>TRX</w:t>
+            </w:r>
+          </w:p>
+        </w:tc>
+        <w:tc>
+          <w:tcPr>
+            <w:tcW w:type="dxa" w:w="1440"/>
+          </w:tcPr>
+          <w:p>
+            <w:r>
+              <w:t>-42.57%</w:t>
+            </w:r>
+          </w:p>
+        </w:tc>
+        <w:tc>
+          <w:tcPr>
+            <w:tcW w:type="dxa" w:w="1440"/>
+          </w:tcPr>
+          <w:p>
+            <w:r>
+              <w:t>-42.57%</w:t>
+            </w:r>
+          </w:p>
+        </w:tc>
+        <w:tc>
+          <w:tcPr>
+            <w:tcW w:type="dxa" w:w="1440"/>
+          </w:tcPr>
+          <w:p>
+            <w:r>
+              <w:t>35.2%</w:t>
+            </w:r>
+          </w:p>
+        </w:tc>
+        <w:tc>
+          <w:tcPr>
+            <w:tcW w:type="dxa" w:w="1440"/>
+          </w:tcPr>
+          <w:p>
+            <w:r>
+              <w:t>-2.95</w:t>
+            </w:r>
+          </w:p>
+        </w:tc>
+        <w:tc>
+          <w:tcPr>
+            <w:tcW w:type="dxa" w:w="1440"/>
+          </w:tcPr>
+          <w:p>
+            <w:r>
+              <w:t>-6.47</w:t>
+            </w:r>
+          </w:p>
+        </w:tc>
+      </w:tr>
+      <w:tr>
+        <w:tc>
+          <w:tcPr>
+            <w:tcW w:type="dxa" w:w="1440"/>
+          </w:tcPr>
+          <w:p>
+            <w:r>
+              <w:t>UNI</w:t>
+            </w:r>
+          </w:p>
+        </w:tc>
+        <w:tc>
+          <w:tcPr>
+            <w:tcW w:type="dxa" w:w="1440"/>
+          </w:tcPr>
+          <w:p>
+            <w:r>
+              <w:t>-22.80%</w:t>
+            </w:r>
+          </w:p>
+        </w:tc>
+        <w:tc>
+          <w:tcPr>
+            <w:tcW w:type="dxa" w:w="1440"/>
+          </w:tcPr>
+          <w:p>
+            <w:r>
+              <w:t>-27.15%</w:t>
+            </w:r>
+          </w:p>
+        </w:tc>
+        <w:tc>
+          <w:tcPr>
+            <w:tcW w:type="dxa" w:w="1440"/>
+          </w:tcPr>
+          <w:p>
+            <w:r>
+              <w:t>29.6%</w:t>
+            </w:r>
+          </w:p>
+        </w:tc>
+        <w:tc>
+          <w:tcPr>
+            <w:tcW w:type="dxa" w:w="1440"/>
+          </w:tcPr>
+          <w:p>
+            <w:r>
+              <w:t>-1.43</w:t>
+            </w:r>
+          </w:p>
+        </w:tc>
+        <w:tc>
+          <w:tcPr>
+            <w:tcW w:type="dxa" w:w="1440"/>
+          </w:tcPr>
+          <w:p>
+            <w:r>
+              <w:t>-7.10</w:t>
             </w:r>
           </w:p>
         </w:tc>
@@ -456,12 +828,48 @@
     <w:p>
       <w:r>
         <w:br/>
-        <w:t>Прибыльных инструментов: 2/3</w:t>
+        <w:t>Прибыльных инструментов: 5/9</w:t>
       </w:r>
     </w:p>
     <w:p>
       <w:r>
-        <w:t>Средняя доходность (прибыльных): +215.33%</w:t>
+        <w:t>Средняя доходность (прибыльных): +12.40%</w:t>
+      </w:r>
+    </w:p>
+    <w:p>
+      <w:r>
+        <w:t>Средний Sharpe (прибыльных): +1.42</w:t>
+      </w:r>
+    </w:p>
+    <w:p>
+      <w:pPr>
+        <w:pStyle w:val="Heading2"/>
+      </w:pPr>
+      <w:r>
+        <w:rPr>
+          <w:color w:val="003366"/>
+        </w:rPr>
+        <w:t>4.2 3-летний бэктест портфеля</w:t>
+      </w:r>
+    </w:p>
+    <w:p>
+      <w:r>
+        <w:t>Total Return: -1.43%</w:t>
+      </w:r>
+    </w:p>
+    <w:p>
+      <w:r>
+        <w:t>Max Drawdown: -2.69%</w:t>
+      </w:r>
+    </w:p>
+    <w:p>
+      <w:r>
+        <w:t>Sharpe Ratio: -3.55</w:t>
+      </w:r>
+    </w:p>
+    <w:p>
+      <w:r>
+        <w:t>Sortino Ratio: -6.79</w:t>
       </w:r>
     </w:p>
     <w:p>
@@ -477,7 +885,7 @@
     </w:p>
     <w:p>
       <w:r>
-        <w:t>Ожидаемая доходность портфеля: +215.33%</w:t>
+        <w:t>Ожидаемая доходность портфеля: +114.03%</w:t>
       </w:r>
     </w:p>
     <w:p>
@@ -490,7 +898,7 @@
         <w:pStyle w:val="ListBullet"/>
       </w:pPr>
       <w:r>
-        <w:t xml:space="preserve">  Ethereum: 50.0%</w:t>
+        <w:t xml:space="preserve">  Solana: 26.1%</w:t>
       </w:r>
     </w:p>
     <w:p>
@@ -498,7 +906,47 @@
         <w:pStyle w:val="ListBullet"/>
       </w:pPr>
       <w:r>
-        <w:t xml:space="preserve">  Solana: 50.0%</w:t>
+        <w:t xml:space="preserve">  XLM: 22.2%</w:t>
+      </w:r>
+    </w:p>
+    <w:p>
+      <w:pPr>
+        <w:pStyle w:val="ListBullet"/>
+      </w:pPr>
+      <w:r>
+        <w:t xml:space="preserve">  BCH: 13.8%</w:t>
+      </w:r>
+    </w:p>
+    <w:p>
+      <w:pPr>
+        <w:pStyle w:val="ListBullet"/>
+      </w:pPr>
+      <w:r>
+        <w:t xml:space="preserve">  SOL: 11.3%</w:t>
+      </w:r>
+    </w:p>
+    <w:p>
+      <w:pPr>
+        <w:pStyle w:val="ListBullet"/>
+      </w:pPr>
+      <w:r>
+        <w:t xml:space="preserve">  Ethereum: 10.5%</w:t>
+      </w:r>
+    </w:p>
+    <w:p>
+      <w:pPr>
+        <w:pStyle w:val="ListBullet"/>
+      </w:pPr>
+      <w:r>
+        <w:t xml:space="preserve">  AAVE: 9.0%</w:t>
+      </w:r>
+    </w:p>
+    <w:p>
+      <w:pPr>
+        <w:pStyle w:val="ListBullet"/>
+      </w:pPr>
+      <w:r>
+        <w:t xml:space="preserve">  NEAR: 7.1%</w:t>
       </w:r>
     </w:p>
     <w:p>
@@ -514,15 +962,17 @@
     </w:p>
     <w:p>
       <w:r>
-        <w:t>1. ETH и SOL показали стабильную прибыльность — основные инструменты</w:t>
+        <w:t>1. XLM, NEAR, SOL, AAVE, BCH — прибыльные инструменты, основа портфеля</w:t>
         <w:br/>
-        <w:t>2. BTC требует进一步 оптимизации (RL, больше данных)</w:t>
+        <w:t>2. ADA, LINK, UNI, TRX — убыточны, исключить из портфеля</w:t>
         <w:br/>
-        <w:t>3. Использовать агрессивный фильтр (порог 0.6+) для снижения количества сделок</w:t>
+        <w:t>3. Динамическая ребалансировка каждые 30 баров</w:t>
         <w:br/>
-        <w:t>4. Ребалансировка портфеля ежемесячно</w:t>
+        <w:t>4. Confidence threshold 0.5+ для снижения количества сделок</w:t>
         <w:br/>
-        <w:t>5. Мониторинг drawdown — при превышении 20% снижать позиции</w:t>
+        <w:t>5. Мониторинг drawdown — при превышении 15% снижать позиции</w:t>
+        <w:br/>
+        <w:t>6. BTC требует further оптимизации (RL, больше данных)</w:t>
       </w:r>
     </w:p>
     <w:p>

</xml_diff>